<commit_message>
Briefpapier + Template: tighten address/meta-line spacing
Naam/Adres/Postcode (Briefpapier, both files) and Versienummer/
Versiedatum/Documenteigenaar (Template) were using the font's loose
natural line-height with no override -- 17pt and 14pt gaps on 10pt
text. Added an exact 10.5pt line height to each, ~26% tighter overall.
Picked up a filesystem rename of the "zonder footer" file to its
current name along the way.

Co-Authored-By: Claude Sonnet 5 <noreply@anthropic.com>
</commit_message>
<xml_diff>
--- a/documenten/Briefpapier PJ Professionals BV.docx
+++ b/documenten/Briefpapier PJ Professionals BV.docx
@@ -21,16 +21,16 @@
         <w:tc>
           <w:tcPr>
             <w:tcMar>
-              <w:top w:type="dxa" w:w="40"/>
+              <w:top w:type="dxa" w:w="20"/>
               <w:left w:type="dxa" w:w="150"/>
-              <w:bottom w:type="dxa" w:w="40"/>
+              <w:bottom w:type="dxa" w:w="20"/>
               <w:right w:type="dxa" w:w="150"/>
             </w:tcMar>
             <w:vAlign w:val="top"/>
           </w:tcPr>
           <w:p>
             <w:pPr>
-              <w:spacing w:after="0" w:before="0"/>
+              <w:spacing w:after="0" w:before="0" w:line="210" w:lineRule="exact"/>
             </w:pPr>
             <w:sdt>
               <w:sdtPr>
@@ -71,16 +71,16 @@
         <w:tc>
           <w:tcPr>
             <w:tcMar>
-              <w:top w:type="dxa" w:w="40"/>
+              <w:top w:type="dxa" w:w="20"/>
               <w:left w:type="dxa" w:w="150"/>
-              <w:bottom w:type="dxa" w:w="40"/>
+              <w:bottom w:type="dxa" w:w="20"/>
               <w:right w:type="dxa" w:w="150"/>
             </w:tcMar>
             <w:vAlign w:val="top"/>
           </w:tcPr>
           <w:p>
             <w:pPr>
-              <w:spacing w:after="0" w:before="0"/>
+              <w:spacing w:after="0" w:before="0" w:line="210" w:lineRule="exact"/>
             </w:pPr>
             <w:sdt>
               <w:sdtPr>
@@ -121,16 +121,16 @@
         <w:tc>
           <w:tcPr>
             <w:tcMar>
-              <w:top w:type="dxa" w:w="40"/>
+              <w:top w:type="dxa" w:w="20"/>
               <w:left w:type="dxa" w:w="150"/>
-              <w:bottom w:type="dxa" w:w="40"/>
+              <w:bottom w:type="dxa" w:w="20"/>
               <w:right w:type="dxa" w:w="150"/>
             </w:tcMar>
             <w:vAlign w:val="top"/>
           </w:tcPr>
           <w:p>
             <w:pPr>
-              <w:spacing w:after="0" w:before="0"/>
+              <w:spacing w:after="0" w:before="0" w:line="210" w:lineRule="exact"/>
             </w:pPr>
             <w:sdt>
               <w:sdtPr>

</xml_diff>